<commit_message>
Update 2.5.1 classes to four-class scheme; add draft of section 2.5.2 (traditional ML)
Co-Authored-By: Claude Opus 5.5 <noreply@anthropic.com>
Claude-Session: https://claude.ai/code/session_01KrVvuWxDmBDGvHTuGVMuit
</commit_message>
<xml_diff>
--- a/literature-review/Section_2.5.1_PD_Classification_Problem.docx
+++ b/literature-review/Section_2.5.1_PD_Classification_Problem.docx
@@ -450,7 +450,7 @@
           <w:sz w:val="22"/>
           <w:szCs w:val="22"/>
         </w:rPr>
-        <w:t xml:space="preserve">, produced at sharp points or edges of conductors in air, which are not typically regarded as hazardous [4]. Figure 3 shows laboratory examples of the three defect types.</w:t>
+        <w:t xml:space="preserve">, produced at sharp points or edges of conductors in air, which are not typically regarded as hazardous [4]. Figure 3 shows laboratory examples of the three defect types. A void or cavity is one physical form of internal discharge, so “void” and “internal PD” describe the same class rather than two separate classes.</w:t>
       </w:r>
     </w:p>
     <w:p>
@@ -630,7 +630,97 @@
           <w:sz w:val="22"/>
           <w:szCs w:val="22"/>
         </w:rPr>
-        <w:t xml:space="preserve"> defects [8]. The class list is therefore a design decision of each project, and the classes adopted for this project will be confirmed with the supervisors and the laboratory capabilities.</w:t>
+        <w:t xml:space="preserve"> defects [8]. The class list is therefore a design decision of each project. Following the PD types highlighted by the supervisors and the three-type categorisation of Kumar </w:t>
+      </w:r>
+      <w:r>
+        <w:rPr>
+          <w:rFonts w:ascii="Calibri" w:cs="Calibri" w:eastAsia="Calibri" w:hAnsi="Calibri"/>
+          <w:i/>
+          <w:iCs/>
+          <w:sz w:val="22"/>
+          <w:szCs w:val="22"/>
+        </w:rPr>
+        <w:t xml:space="preserve">et al.</w:t>
+      </w:r>
+      <w:r>
+        <w:rPr>
+          <w:rFonts w:ascii="Calibri" w:cs="Calibri" w:eastAsia="Calibri" w:hAnsi="Calibri"/>
+          <w:sz w:val="22"/>
+          <w:szCs w:val="22"/>
+        </w:rPr>
+        <w:t xml:space="preserve"> [4], this project adopts four classes: (1) </w:t>
+      </w:r>
+      <w:r>
+        <w:rPr>
+          <w:rFonts w:ascii="Calibri" w:cs="Calibri" w:eastAsia="Calibri" w:hAnsi="Calibri"/>
+          <w:b/>
+          <w:bCs/>
+          <w:sz w:val="22"/>
+          <w:szCs w:val="22"/>
+        </w:rPr>
+        <w:t xml:space="preserve">internal PD</w:t>
+      </w:r>
+      <w:r>
+        <w:rPr>
+          <w:rFonts w:ascii="Calibri" w:cs="Calibri" w:eastAsia="Calibri" w:hAnsi="Calibri"/>
+          <w:sz w:val="22"/>
+          <w:szCs w:val="22"/>
+        </w:rPr>
+        <w:t xml:space="preserve">, including void or cavity discharge; (2) </w:t>
+      </w:r>
+      <w:r>
+        <w:rPr>
+          <w:rFonts w:ascii="Calibri" w:cs="Calibri" w:eastAsia="Calibri" w:hAnsi="Calibri"/>
+          <w:b/>
+          <w:bCs/>
+          <w:sz w:val="22"/>
+          <w:szCs w:val="22"/>
+        </w:rPr>
+        <w:t xml:space="preserve">surface PD</w:t>
+      </w:r>
+      <w:r>
+        <w:rPr>
+          <w:rFonts w:ascii="Calibri" w:cs="Calibri" w:eastAsia="Calibri" w:hAnsi="Calibri"/>
+          <w:sz w:val="22"/>
+          <w:szCs w:val="22"/>
+        </w:rPr>
+        <w:t xml:space="preserve">; (3) </w:t>
+      </w:r>
+      <w:r>
+        <w:rPr>
+          <w:rFonts w:ascii="Calibri" w:cs="Calibri" w:eastAsia="Calibri" w:hAnsi="Calibri"/>
+          <w:b/>
+          <w:bCs/>
+          <w:sz w:val="22"/>
+          <w:szCs w:val="22"/>
+        </w:rPr>
+        <w:t xml:space="preserve">corona</w:t>
+      </w:r>
+      <w:r>
+        <w:rPr>
+          <w:rFonts w:ascii="Calibri" w:cs="Calibri" w:eastAsia="Calibri" w:hAnsi="Calibri"/>
+          <w:sz w:val="22"/>
+          <w:szCs w:val="22"/>
+        </w:rPr>
+        <w:t xml:space="preserve">; and (4) </w:t>
+      </w:r>
+      <w:r>
+        <w:rPr>
+          <w:rFonts w:ascii="Calibri" w:cs="Calibri" w:eastAsia="Calibri" w:hAnsi="Calibri"/>
+          <w:b/>
+          <w:bCs/>
+          <w:sz w:val="22"/>
+          <w:szCs w:val="22"/>
+        </w:rPr>
+        <w:t xml:space="preserve">noise / no PD</w:t>
+      </w:r>
+      <w:r>
+        <w:rPr>
+          <w:rFonts w:ascii="Calibri" w:cs="Calibri" w:eastAsia="Calibri" w:hAnsi="Calibri"/>
+          <w:sz w:val="22"/>
+          <w:szCs w:val="22"/>
+        </w:rPr>
+        <w:t xml:space="preserve">, i.e., background recordings without an active defect. The fourth class is included because separating PD from interference is itself part of the classification task [9].</w:t>
       </w:r>
     </w:p>
     <w:p>
@@ -3220,7 +3310,7 @@
           <w:sz w:val="22"/>
           <w:szCs w:val="22"/>
         </w:rPr>
-        <w:t xml:space="preserve">Based on this review, the project treats PD classification as a supervised, multi-class problem in which each measured record is assigned to one of a small set of physically prepared defect classes. The task is limited to classifying existing PD activity; detecting PD, predicting failure and locating defects are related but separate objectives. Three points from the literature shape the planned work. First, the class list and the input representation (time-domain waveform, PRPD pattern, or both) must be fixed together with the measurement system, because each representation keeps different information [2]. Second, noise and the possibility of simultaneous or unknown sources mean that the classifier should be tested on noisy data and should be able to report an uncertain result [1], [3], [5]. Third, because results on a single specimen can overstate performance on new specimens [6], the dataset will record which specimen and session every measurement comes from, so that training and test data can be kept separate.</w:t>
+        <w:t xml:space="preserve">Based on this review, the project treats PD classification as a supervised, multi-class problem in which each measured record is assigned to one of four classes: internal PD (void/cavity), surface PD, corona, or noise / no PD. In addition, the classifier will be allowed to return an “unknown” result when its confidence is low, so that patterns unlike any trained class are not forced into one of them (Figure 2, outcome 3) [3], [5]. The task is limited to classifying existing PD activity; detecting PD, predicting failure and locating defects are related but separate objectives. Three points from the literature shape the planned work. First, the class list and the input representation (time-domain waveform, PRPD pattern, or both) must be fixed together with the measurement system, because each representation keeps different information [2]. Second, noise and the possibility of simultaneous sources mean that the classifier should be tested on noisy data, including real background recordings [1], [4]. Third, because results on a single specimen can overstate performance on new specimens [6], the dataset will record which specimen and session every measurement comes from, so that training and test data can be kept separate.</w:t>
       </w:r>
     </w:p>
     <w:p>
@@ -3287,7 +3377,7 @@
         </w:rPr>
         <w:t xml:space="preserve"> </w:t>
       </w:r>
-      <w:hyperlink w:history="1" r:id="rIddqssfyic3f2aryblaq5em">
+      <w:hyperlink w:history="1" r:id="rIdojwnxkqvble_ibrmzpagi">
         <w:r>
           <w:rPr>
             <w:rStyle w:val="Hyperlink"/>
@@ -3346,7 +3436,7 @@
         </w:rPr>
         <w:t xml:space="preserve"> </w:t>
       </w:r>
-      <w:hyperlink w:history="1" r:id="rIdpavp-hzmplhiwf2qlagtm">
+      <w:hyperlink w:history="1" r:id="rIddzq1xbc8ubew6au89rzys">
         <w:r>
           <w:rPr>
             <w:rStyle w:val="Hyperlink"/>
@@ -3405,7 +3495,7 @@
         </w:rPr>
         <w:t xml:space="preserve"> </w:t>
       </w:r>
-      <w:hyperlink w:history="1" r:id="rIdehc3ekzntaymhidrnyksj">
+      <w:hyperlink w:history="1" r:id="rIdsmhrn0sndxw4qjyzijmqp">
         <w:r>
           <w:rPr>
             <w:rStyle w:val="Hyperlink"/>
@@ -3464,7 +3554,7 @@
         </w:rPr>
         <w:t xml:space="preserve"> </w:t>
       </w:r>
-      <w:hyperlink w:history="1" r:id="rIdhzmhq9argwrajogyuyhaf">
+      <w:hyperlink w:history="1" r:id="rIdzyb4jdmzlgqhdjdztefxj">
         <w:r>
           <w:rPr>
             <w:rStyle w:val="Hyperlink"/>
@@ -3523,7 +3613,7 @@
         </w:rPr>
         <w:t xml:space="preserve"> </w:t>
       </w:r>
-      <w:hyperlink w:history="1" r:id="rIdoum16qzmtansatmd6onua">
+      <w:hyperlink w:history="1" r:id="rIdjiday7jd1wqu1yqzz_enx">
         <w:r>
           <w:rPr>
             <w:rStyle w:val="Hyperlink"/>
@@ -3582,7 +3672,7 @@
         </w:rPr>
         <w:t xml:space="preserve"> </w:t>
       </w:r>
-      <w:hyperlink w:history="1" r:id="rIdc9xuvguk_miprbodgvl50">
+      <w:hyperlink w:history="1" r:id="rIdndnvjn16bqedyo69rsibq">
         <w:r>
           <w:rPr>
             <w:rStyle w:val="Hyperlink"/>
@@ -3659,7 +3749,7 @@
         </w:rPr>
         <w:t xml:space="preserve"> </w:t>
       </w:r>
-      <w:hyperlink w:history="1" r:id="rId348yncs67awg2lflct1ul">
+      <w:hyperlink w:history="1" r:id="rIdpu9qgtztwcayccactjbrc">
         <w:r>
           <w:rPr>
             <w:rStyle w:val="Hyperlink"/>
@@ -3736,7 +3826,7 @@
         </w:rPr>
         <w:t xml:space="preserve"> </w:t>
       </w:r>
-      <w:hyperlink w:history="1" r:id="rIdsfxxmphh8zmvbhb726gfo">
+      <w:hyperlink w:history="1" r:id="rId2wktpm3qnx1xjahvqzv0w">
         <w:r>
           <w:rPr>
             <w:rStyle w:val="Hyperlink"/>
@@ -3813,7 +3903,7 @@
         </w:rPr>
         <w:t xml:space="preserve"> </w:t>
       </w:r>
-      <w:hyperlink w:history="1" r:id="rIdvfqbcqfhttn0uo6zycvgo">
+      <w:hyperlink w:history="1" r:id="rIdvhfvp89ggagfrc-oxgogt">
         <w:r>
           <w:rPr>
             <w:rStyle w:val="Hyperlink"/>

</xml_diff>

<commit_message>
2.5.1: state failure prediction as project objective with ageing-based route
Co-Authored-By: Claude Opus 5.5 <noreply@anthropic.com>
Claude-Session: https://claude.ai/code/session_01KrVvuWxDmBDGvHTuGVMuit
</commit_message>
<xml_diff>
--- a/literature-review/Section_2.5.1_PD_Classification_Problem.docx
+++ b/literature-review/Section_2.5.1_PD_Classification_Problem.docx
@@ -108,15 +108,15 @@
           <w:sz w:val="22"/>
           <w:szCs w:val="22"/>
         </w:rPr>
-        <w:t xml:space="preserve">Prediction</w:t>
-      </w:r>
-      <w:r>
-        <w:rPr>
-          <w:rFonts w:ascii="Calibri" w:cs="Calibri" w:eastAsia="Calibri" w:hAnsi="Calibri"/>
-          <w:sz w:val="22"/>
-          <w:szCs w:val="22"/>
-        </w:rPr>
-        <w:t xml:space="preserve"> of a discharge or failure before it occurs is a separate and harder objective that is outside the scope of this stage. The classifier also does not replace the measurement system: it interprets the measured data, and the final operational “go / no-go” decision on the equipment is based on knowledge of the danger of each defect and is usually made by people [2].</w:t>
+        <w:t xml:space="preserve">Failure prediction</w:t>
+      </w:r>
+      <w:r>
+        <w:rPr>
+          <w:rFonts w:ascii="Calibri" w:cs="Calibri" w:eastAsia="Calibri" w:hAnsi="Calibri"/>
+          <w:sz w:val="22"/>
+          <w:szCs w:val="22"/>
+        </w:rPr>
+        <w:t xml:space="preserve"> estimates, from how PD activity develops over time, that the insulation is approaching failure, so that a warning can be raised before breakdown. Failure prediction is a key objective of this project, and classification is its first step: the danger of PD depends on the type of defect, and the operational decision on the equipment is based on knowledge of the danger of each defect [2]. The classifier also does not replace the measurement system: it interprets the measured data, and the final “go / no-go” decision is usually made by people [2].</w:t>
       </w:r>
     </w:p>
     <w:p>
@@ -2098,7 +2098,31 @@
           <w:sz w:val="22"/>
           <w:szCs w:val="22"/>
         </w:rPr>
-        <w:t xml:space="preserve">The project treats PD classification as a supervised, multi-class problem in which each measured record is assigned to one of four classes: internal PD (void/cavity), surface PD, corona, or noise / no PD. The classifier will also be allowed to return an “unknown” result when its confidence is low, so that patterns unlike any trained class are not forced into one of them (Figure 2, outcome 3) [2], [3]. The task is limited to classifying existing PD activity; detecting PD, predicting failure and locating defects are related but separate objectives. Two further points follow from the literature. First, the class list and the input representation must be fixed together with the measurement system, because each representation keeps different information [1]. Second, because results on one set of specimens can overstate performance on new specimens [5], the dataset will record which specimen and session every measurement comes from, so that training and test data can be kept separate.</w:t>
+        <w:t xml:space="preserve">The project treats PD classification as a supervised, multi-class problem in which each measured record is assigned to one of four classes: internal PD (void/cavity), surface PD, corona, or noise / no PD. The classifier will also be allowed to return an “unknown” result when its confidence is low, so that patterns unlike any trained class are not forced into one of them (Figure 2, outcome 3) [2], [3]. Two further points follow from the literature. First, the class list and the input representation must be fixed together with the measurement system, because each representation keeps different information [1]. Second, because results on one set of specimens can overstate performance on new specimens [5], the dataset will record which specimen and session every measurement comes from, so that training and test data can be kept separate.</w:t>
+      </w:r>
+    </w:p>
+    <w:p>
+      <w:pPr>
+        <w:spacing w:after="140" w:line="276"/>
+        <w:jc w:val="both"/>
+      </w:pPr>
+      <w:r>
+        <w:rPr>
+          <w:rFonts w:ascii="Calibri" w:cs="Calibri" w:eastAsia="Calibri" w:hAnsi="Calibri"/>
+          <w:b/>
+          <w:bCs/>
+          <w:sz w:val="22"/>
+          <w:szCs w:val="22"/>
+        </w:rPr>
+        <w:t xml:space="preserve">Towards failure prediction.</w:t>
+      </w:r>
+      <w:r>
+        <w:rPr>
+          <w:rFonts w:ascii="Calibri" w:cs="Calibri" w:eastAsia="Calibri" w:hAnsi="Calibri"/>
+          <w:sz w:val="22"/>
+          <w:szCs w:val="22"/>
+        </w:rPr>
+        <w:t xml:space="preserve"> The literature indicates how classification can be extended to prediction. PD distributions can change significantly during the ageing of insulation, and this has been used to assess the degree of insulation degradation with encouraging results [2]; the pulse shape of discharges from cavities also changes with time as a result of PD-induced ageing, which could be used for monitoring insulation systems [2]. Krivda therefore identified monitoring the ageing of insulation through PD recognition as a direction for future automated systems [2]. The planned route is: (1) classify the defect type, since internal PD is considered the most dangerous [4]; (2) track how the PD features of that defect change over repeated measurements; and (3) raise an early warning when the trend indicates progressing degradation. Steps (2) and (3) require measurements recorded over time as the insulation ages, and will be developed once the classifier is established.</w:t>
       </w:r>
     </w:p>
     <w:p>
@@ -2165,7 +2189,7 @@
         </w:rPr>
         <w:t xml:space="preserve"> </w:t>
       </w:r>
-      <w:hyperlink w:history="1" r:id="rIdqhvas1rhxzi7ofnjezhpr">
+      <w:hyperlink w:history="1" r:id="rId5fj7hvaw6kmxxvhnwkrm5">
         <w:r>
           <w:rPr>
             <w:rStyle w:val="Hyperlink"/>
@@ -2224,7 +2248,7 @@
         </w:rPr>
         <w:t xml:space="preserve"> </w:t>
       </w:r>
-      <w:hyperlink w:history="1" r:id="rIduvrrnpyfiijt8ezklfuqy">
+      <w:hyperlink w:history="1" r:id="rId2-rao58jc-7_f1aoaeii0">
         <w:r>
           <w:rPr>
             <w:rStyle w:val="Hyperlink"/>
@@ -2283,7 +2307,7 @@
         </w:rPr>
         <w:t xml:space="preserve"> </w:t>
       </w:r>
-      <w:hyperlink w:history="1" r:id="rIdeow-xkkasntdkixggyax-">
+      <w:hyperlink w:history="1" r:id="rId06jwmw8cnkups0zmctd_1">
         <w:r>
           <w:rPr>
             <w:rStyle w:val="Hyperlink"/>
@@ -2342,7 +2366,7 @@
         </w:rPr>
         <w:t xml:space="preserve"> </w:t>
       </w:r>
-      <w:hyperlink w:history="1" r:id="rIdi4mwvwi9ez4cvn76qhvwh">
+      <w:hyperlink w:history="1" r:id="rIdxd2zehyd9jocqvjlmzzp4">
         <w:r>
           <w:rPr>
             <w:rStyle w:val="Hyperlink"/>
@@ -2401,7 +2425,7 @@
         </w:rPr>
         <w:t xml:space="preserve"> </w:t>
       </w:r>
-      <w:hyperlink w:history="1" r:id="rId3zgyvlicmyldk9egllxee">
+      <w:hyperlink w:history="1" r:id="rId2qiflaofql75vgzwkmo8m">
         <w:r>
           <w:rPr>
             <w:rStyle w:val="Hyperlink"/>
@@ -2478,7 +2502,7 @@
         </w:rPr>
         <w:t xml:space="preserve"> </w:t>
       </w:r>
-      <w:hyperlink w:history="1" r:id="rIdeq4atxucfpwajm2mgvh4n">
+      <w:hyperlink w:history="1" r:id="rIdf_e51z7cpfdaxzqjcqtdh">
         <w:r>
           <w:rPr>
             <w:rStyle w:val="Hyperlink"/>
@@ -2555,7 +2579,7 @@
         </w:rPr>
         <w:t xml:space="preserve"> </w:t>
       </w:r>
-      <w:hyperlink w:history="1" r:id="rIdhmbd2vijutp59z2akebfa">
+      <w:hyperlink w:history="1" r:id="rIdckf3s3yn8gnzvghqz850u">
         <w:r>
           <w:rPr>
             <w:rStyle w:val="Hyperlink"/>
@@ -2614,7 +2638,7 @@
         </w:rPr>
         <w:t xml:space="preserve"> </w:t>
       </w:r>
-      <w:hyperlink w:history="1" r:id="rIdzllor2ds0-hitrz3swxoi">
+      <w:hyperlink w:history="1" r:id="rIdy9nezixoxrdouw08lnbbr">
         <w:r>
           <w:rPr>
             <w:rStyle w:val="Hyperlink"/>
@@ -2691,7 +2715,7 @@
         </w:rPr>
         <w:t xml:space="preserve"> </w:t>
       </w:r>
-      <w:hyperlink w:history="1" r:id="rIdthrobnjnpeomenhn9-jei">
+      <w:hyperlink w:history="1" r:id="rIdqdpeewofrs55lnjkspu1r">
         <w:r>
           <w:rPr>
             <w:rStyle w:val="Hyperlink"/>

</xml_diff>

<commit_message>
2.5.1: mark class list as provisional pending lab capabilities
Co-Authored-By: Claude Opus 5.5 <noreply@anthropic.com>
Claude-Session: https://claude.ai/code/session_01KrVvuWxDmBDGvHTuGVMuit
</commit_message>
<xml_diff>
--- a/literature-review/Section_2.5.1_PD_Classification_Problem.docx
+++ b/literature-review/Section_2.5.1_PD_Classification_Problem.docx
@@ -1622,7 +1622,25 @@
           <w:sz w:val="22"/>
           <w:szCs w:val="22"/>
         </w:rPr>
-        <w:t xml:space="preserve">Following the PD types highlighted by the supervisors and the three-type grouping of Kumar </w:t>
+        <w:t xml:space="preserve">For this project, a </w:t>
+      </w:r>
+      <w:r>
+        <w:rPr>
+          <w:rFonts w:ascii="Calibri" w:cs="Calibri" w:eastAsia="Calibri" w:hAnsi="Calibri"/>
+          <w:b/>
+          <w:bCs/>
+          <w:sz w:val="22"/>
+          <w:szCs w:val="22"/>
+        </w:rPr>
+        <w:t xml:space="preserve">provisional</w:t>
+      </w:r>
+      <w:r>
+        <w:rPr>
+          <w:rFonts w:ascii="Calibri" w:cs="Calibri" w:eastAsia="Calibri" w:hAnsi="Calibri"/>
+          <w:sz w:val="22"/>
+          <w:szCs w:val="22"/>
+        </w:rPr>
+        <w:t xml:space="preserve"> set of four classes is proposed, based on the PD types highlighted by the supervisors, the three-type grouping of Kumar </w:t>
       </w:r>
       <w:r>
         <w:rPr>
@@ -1640,7 +1658,7 @@
           <w:sz w:val="22"/>
           <w:szCs w:val="22"/>
         </w:rPr>
-        <w:t xml:space="preserve"> [4], this project adopts four classes: (1) </w:t>
+        <w:t xml:space="preserve"> [4], and the defects that are expected to be reproducible in the HVDM laboratory: (1) </w:t>
       </w:r>
       <w:r>
         <w:rPr>
@@ -1712,7 +1730,7 @@
           <w:sz w:val="22"/>
           <w:szCs w:val="22"/>
         </w:rPr>
-        <w:t xml:space="preserve">, i.e., background recordings without an active defect. A void is one physical form of internal discharge, so “void” and “internal PD” are treated as one class rather than two. The fourth class is included because separating PD from interference is itself part of the classification task [9].</w:t>
+        <w:t xml:space="preserve">, i.e., background recordings without an active defect. A void is one physical form of internal discharge, so “void” and “internal PD” are treated as one class rather than two. The noise class is included because separating PD from interference is itself part of the classification task [9]. The final class list will be confirmed once the defects that can be prepared safely and measured reliably in the laboratory are known; classes may be added (for example a floating-electrode defect) or merged if the data do not support them.</w:t>
       </w:r>
     </w:p>
     <w:p>
@@ -2098,7 +2116,7 @@
           <w:sz w:val="22"/>
           <w:szCs w:val="22"/>
         </w:rPr>
-        <w:t xml:space="preserve">The project treats PD classification as a supervised, multi-class problem in which each measured record is assigned to one of four classes: internal PD (void/cavity), surface PD, corona, or noise / no PD. The classifier will also be allowed to return an “unknown” result when its confidence is low, so that patterns unlike any trained class are not forced into one of them (Figure 2, outcome 3) [2], [3]. Two further points follow from the literature. First, the class list and the input representation must be fixed together with the measurement system, because each representation keeps different information [1]. Second, because results on one set of specimens can overstate performance on new specimens [5], the dataset will record which specimen and session every measurement comes from, so that training and test data can be kept separate.</w:t>
+        <w:t xml:space="preserve">The project treats PD classification as a supervised, multi-class problem in which each measured record is assigned to one of the provisional classes defined in Section 2.5.1.2. The classifier will also be allowed to return an “unknown” result when its confidence is low, so that patterns unlike any trained class are not forced into one of them (Figure 2, outcome 3) [2], [3]. Two further points follow from the literature. First, the class list and the input representation must be fixed together with the measurement system, because each representation keeps different information [1]. Second, because results on one set of specimens can overstate performance on new specimens [5], the dataset will record which specimen and session every measurement comes from, so that training and test data can be kept separate.</w:t>
       </w:r>
     </w:p>
     <w:p>
@@ -2189,7 +2207,7 @@
         </w:rPr>
         <w:t xml:space="preserve"> </w:t>
       </w:r>
-      <w:hyperlink w:history="1" r:id="rId5fj7hvaw6kmxxvhnwkrm5">
+      <w:hyperlink w:history="1" r:id="rId7vwtzzw9uztbfjbuitoiw">
         <w:r>
           <w:rPr>
             <w:rStyle w:val="Hyperlink"/>
@@ -2248,7 +2266,7 @@
         </w:rPr>
         <w:t xml:space="preserve"> </w:t>
       </w:r>
-      <w:hyperlink w:history="1" r:id="rId2-rao58jc-7_f1aoaeii0">
+      <w:hyperlink w:history="1" r:id="rIdayhzpngdprzg1r0u1qbwf">
         <w:r>
           <w:rPr>
             <w:rStyle w:val="Hyperlink"/>
@@ -2307,7 +2325,7 @@
         </w:rPr>
         <w:t xml:space="preserve"> </w:t>
       </w:r>
-      <w:hyperlink w:history="1" r:id="rId06jwmw8cnkups0zmctd_1">
+      <w:hyperlink w:history="1" r:id="rIdadvavp7k9-ccw2vod7q-q">
         <w:r>
           <w:rPr>
             <w:rStyle w:val="Hyperlink"/>
@@ -2366,7 +2384,7 @@
         </w:rPr>
         <w:t xml:space="preserve"> </w:t>
       </w:r>
-      <w:hyperlink w:history="1" r:id="rIdxd2zehyd9jocqvjlmzzp4">
+      <w:hyperlink w:history="1" r:id="rIdvuo-haghukfzxtytwqcbt">
         <w:r>
           <w:rPr>
             <w:rStyle w:val="Hyperlink"/>
@@ -2425,7 +2443,7 @@
         </w:rPr>
         <w:t xml:space="preserve"> </w:t>
       </w:r>
-      <w:hyperlink w:history="1" r:id="rId2qiflaofql75vgzwkmo8m">
+      <w:hyperlink w:history="1" r:id="rIdxx0ad_9lebdqc9axn2chq">
         <w:r>
           <w:rPr>
             <w:rStyle w:val="Hyperlink"/>
@@ -2502,7 +2520,7 @@
         </w:rPr>
         <w:t xml:space="preserve"> </w:t>
       </w:r>
-      <w:hyperlink w:history="1" r:id="rIdf_e51z7cpfdaxzqjcqtdh">
+      <w:hyperlink w:history="1" r:id="rId4na-34bd5ncgsomebu3fr">
         <w:r>
           <w:rPr>
             <w:rStyle w:val="Hyperlink"/>
@@ -2579,7 +2597,7 @@
         </w:rPr>
         <w:t xml:space="preserve"> </w:t>
       </w:r>
-      <w:hyperlink w:history="1" r:id="rIdckf3s3yn8gnzvghqz850u">
+      <w:hyperlink w:history="1" r:id="rIdux78jnzzxnh-htg3wz8l-">
         <w:r>
           <w:rPr>
             <w:rStyle w:val="Hyperlink"/>
@@ -2638,7 +2656,7 @@
         </w:rPr>
         <w:t xml:space="preserve"> </w:t>
       </w:r>
-      <w:hyperlink w:history="1" r:id="rIdy9nezixoxrdouw08lnbbr">
+      <w:hyperlink w:history="1" r:id="rIdb5lpfahpywqjz-nzgaabb">
         <w:r>
           <w:rPr>
             <w:rStyle w:val="Hyperlink"/>
@@ -2715,7 +2733,7 @@
         </w:rPr>
         <w:t xml:space="preserve"> </w:t>
       </w:r>
-      <w:hyperlink w:history="1" r:id="rIdqdpeewofrs55lnjkspu1r">
+      <w:hyperlink w:history="1" r:id="rIdgn-zojqtesb2fhfuzpevv">
         <w:r>
           <w:rPr>
             <w:rStyle w:val="Hyperlink"/>

</xml_diff>